<commit_message>
bit of doc editing
</commit_message>
<xml_diff>
--- a/DOC/NukElk_Prog-doc.docx
+++ b/DOC/NukElk_Prog-doc.docx
@@ -271,7 +271,25 @@
         <w:rPr>
           <w:lang w:val="hu-HU"/>
         </w:rPr>
-        <w:t>Az eszköz USB-n keresztül kapja a tápellátását (esetleg külön fali adapterrel megtámogatva az 5V-os részét).</w:t>
+        <w:t xml:space="preserve">Az </w:t>
+      </w:r>
+      <w:r>
+        <w:rPr>
+          <w:lang w:val="hu-HU"/>
+        </w:rPr>
+        <w:t>mikrokontroller</w:t>
+      </w:r>
+      <w:r>
+        <w:rPr>
+          <w:lang w:val="hu-HU"/>
+        </w:rPr>
+        <w:t xml:space="preserve"> USB-n keresztül kapja a tápellátását</w:t>
+      </w:r>
+      <w:r>
+        <w:rPr>
+          <w:lang w:val="hu-HU"/>
+        </w:rPr>
+        <w:t>, más részektől függetlenül.</w:t>
       </w:r>
     </w:p>
     <w:p>
@@ -937,9 +955,10 @@
       </w:r>
       <w:r>
         <w:rPr>
-          <w:lang w:val="hu-HU"/>
-        </w:rPr>
-        <w:t>600</w:t>
+          <w:highlight w:val="red"/>
+          <w:lang w:val="hu-HU"/>
+        </w:rPr>
+        <w:t>60</w:t>
       </w:r>
       <w:r>
         <w:rPr>
@@ -959,7 +978,239 @@
         <w:rPr>
           <w:lang w:val="hu-HU"/>
         </w:rPr>
-        <w:t>A beállított értékeknél módosítást követően a frissítés a következőek szerint alakul:</w:t>
+        <w:t xml:space="preserve">A beállított értékeknél </w:t>
+      </w:r>
+      <w:r>
+        <w:rPr>
+          <w:lang w:val="hu-HU"/>
+        </w:rPr>
+        <w:t>USART-</w:t>
+      </w:r>
+      <w:proofErr w:type="spellStart"/>
+      <w:r>
+        <w:rPr>
+          <w:lang w:val="hu-HU"/>
+        </w:rPr>
+        <w:t>on</w:t>
+      </w:r>
+      <w:proofErr w:type="spellEnd"/>
+      <w:r>
+        <w:rPr>
+          <w:lang w:val="hu-HU"/>
+        </w:rPr>
+        <w:t xml:space="preserve"> keresztüli </w:t>
+      </w:r>
+      <w:r>
+        <w:rPr>
+          <w:lang w:val="hu-HU"/>
+        </w:rPr>
+        <w:t>módosítást követően a frissítés a következőek szerint alakul</w:t>
+      </w:r>
+      <w:r>
+        <w:rPr>
+          <w:lang w:val="hu-HU"/>
+        </w:rPr>
+        <w:t xml:space="preserve">: </w:t>
+      </w:r>
+      <w:r>
+        <w:rPr>
+          <w:lang w:val="hu-HU"/>
+        </w:rPr>
+        <w:t xml:space="preserve">Kikapcsolt </w:t>
+      </w:r>
+      <w:r>
+        <w:rPr>
+          <w:lang w:val="hu-HU"/>
+        </w:rPr>
+        <w:t>matematika</w:t>
+      </w:r>
+      <w:r>
+        <w:rPr>
+          <w:lang w:val="hu-HU"/>
+        </w:rPr>
+        <w:t xml:space="preserve"> mellett a</w:t>
+      </w:r>
+      <w:r>
+        <w:rPr>
+          <w:lang w:val="hu-HU"/>
+        </w:rPr>
+        <w:t xml:space="preserve"> </w:t>
+      </w:r>
+      <w:proofErr w:type="spellStart"/>
+      <w:r>
+        <w:rPr>
+          <w:lang w:val="hu-HU"/>
+        </w:rPr>
+        <w:t>cps</w:t>
+      </w:r>
+      <w:proofErr w:type="spellEnd"/>
+      <w:r>
+        <w:rPr>
+          <w:lang w:val="hu-HU"/>
+        </w:rPr>
+        <w:t xml:space="preserve"> átírása után nem frissül automatikusan </w:t>
+      </w:r>
+      <w:r>
+        <w:rPr>
+          <w:lang w:val="hu-HU"/>
+        </w:rPr>
+        <w:t>a</w:t>
+      </w:r>
+      <w:r>
+        <w:rPr>
+          <w:lang w:val="hu-HU"/>
+        </w:rPr>
+        <w:t xml:space="preserve">z </w:t>
+      </w:r>
+      <w:proofErr w:type="spellStart"/>
+      <w:r>
+        <w:rPr>
+          <w:lang w:val="hu-HU"/>
+        </w:rPr>
+        <w:t>out_val_R</w:t>
+      </w:r>
+      <w:proofErr w:type="spellEnd"/>
+      <w:r>
+        <w:rPr>
+          <w:lang w:val="hu-HU"/>
+        </w:rPr>
+        <w:t xml:space="preserve">, </w:t>
+      </w:r>
+      <w:r>
+        <w:rPr>
+          <w:lang w:val="hu-HU"/>
+        </w:rPr>
+        <w:t>_</w:t>
+      </w:r>
+      <w:r>
+        <w:rPr>
+          <w:lang w:val="hu-HU"/>
+        </w:rPr>
+        <w:t>V</w:t>
+      </w:r>
+      <w:r>
+        <w:rPr>
+          <w:lang w:val="hu-HU"/>
+        </w:rPr>
+        <w:t>,</w:t>
+      </w:r>
+      <w:r>
+        <w:rPr>
+          <w:lang w:val="hu-HU"/>
+        </w:rPr>
+        <w:t xml:space="preserve"> </w:t>
+      </w:r>
+      <w:r>
+        <w:rPr>
+          <w:lang w:val="hu-HU"/>
+        </w:rPr>
+        <w:t>_</w:t>
+      </w:r>
+      <w:r>
+        <w:rPr>
+          <w:lang w:val="hu-HU"/>
+        </w:rPr>
+        <w:t>mA</w:t>
+      </w:r>
+      <w:r>
+        <w:rPr>
+          <w:lang w:val="hu-HU"/>
+        </w:rPr>
+        <w:t>.</w:t>
+      </w:r>
+      <w:r>
+        <w:rPr>
+          <w:lang w:val="hu-HU"/>
+        </w:rPr>
+        <w:t xml:space="preserve"> A többi paraméter megváltoztatása során a változnak </w:t>
+      </w:r>
+      <w:proofErr w:type="spellStart"/>
+      <w:r>
+        <w:rPr>
+          <w:lang w:val="hu-HU"/>
+        </w:rPr>
+        <w:t>out_val_R</w:t>
+      </w:r>
+      <w:proofErr w:type="spellEnd"/>
+      <w:r>
+        <w:rPr>
+          <w:lang w:val="hu-HU"/>
+        </w:rPr>
+        <w:t xml:space="preserve">, </w:t>
+      </w:r>
+      <w:r>
+        <w:rPr>
+          <w:lang w:val="hu-HU"/>
+        </w:rPr>
+        <w:t>_</w:t>
+      </w:r>
+      <w:r>
+        <w:rPr>
+          <w:lang w:val="hu-HU"/>
+        </w:rPr>
+        <w:t>V</w:t>
+      </w:r>
+      <w:r>
+        <w:rPr>
+          <w:lang w:val="hu-HU"/>
+        </w:rPr>
+        <w:t>,</w:t>
+      </w:r>
+      <w:r>
+        <w:rPr>
+          <w:lang w:val="hu-HU"/>
+        </w:rPr>
+        <w:t xml:space="preserve"> </w:t>
+      </w:r>
+      <w:r>
+        <w:rPr>
+          <w:lang w:val="hu-HU"/>
+        </w:rPr>
+        <w:t>_</w:t>
+      </w:r>
+      <w:r>
+        <w:rPr>
+          <w:lang w:val="hu-HU"/>
+        </w:rPr>
+        <w:t>mA</w:t>
+      </w:r>
+      <w:r>
+        <w:rPr>
+          <w:lang w:val="hu-HU"/>
+        </w:rPr>
+        <w:t>,</w:t>
+      </w:r>
+      <w:r>
+        <w:rPr>
+          <w:lang w:val="hu-HU"/>
+        </w:rPr>
+        <w:t xml:space="preserve"> paraméterek, </w:t>
+      </w:r>
+      <w:r>
+        <w:rPr>
+          <w:lang w:val="hu-HU"/>
+        </w:rPr>
+        <w:t xml:space="preserve">jelenleg eltárolt </w:t>
+      </w:r>
+      <w:proofErr w:type="spellStart"/>
+      <w:r>
+        <w:rPr>
+          <w:lang w:val="hu-HU"/>
+        </w:rPr>
+        <w:t>cps</w:t>
+      </w:r>
+      <w:proofErr w:type="spellEnd"/>
+      <w:r>
+        <w:rPr>
+          <w:lang w:val="hu-HU"/>
+        </w:rPr>
+        <w:t xml:space="preserve"> szerint</w:t>
+      </w:r>
+      <w:r>
+        <w:rPr>
+          <w:lang w:val="hu-HU"/>
+        </w:rPr>
+        <w:t>. A sziréna csak a matematika engedélyezése után kapcsolja az eszköz automatikusan.</w:t>
       </w:r>
     </w:p>
     <w:p>
@@ -971,23 +1222,9 @@
       </w:pPr>
       <w:r>
         <w:rPr>
-          <w:highlight w:val="red"/>
-          <w:lang w:val="hu-HU"/>
-        </w:rPr>
-        <w:t>TBD</w:t>
-      </w:r>
-    </w:p>
-    <w:p>
-      <w:pPr>
-        <w:jc w:val="both"/>
-        <w:rPr>
-          <w:lang w:val="hu-HU"/>
-        </w:rPr>
-      </w:pPr>
-      <w:r>
-        <w:rPr>
-          <w:lang w:val="hu-HU"/>
-        </w:rPr>
+          <w:lang w:val="hu-HU"/>
+        </w:rPr>
+        <w:lastRenderedPageBreak/>
         <w:t>A</w:t>
       </w:r>
       <w:r>
@@ -1012,27 +1249,13 @@
         <w:rPr>
           <w:lang w:val="hu-HU"/>
         </w:rPr>
-        <w:t xml:space="preserve">A pontos mérés érdekében 1 darab hardver-megszakítás érkezhet a számláló egység felől 1mp elteltével, hogy a következő ciklusban már az új érték </w:t>
-      </w:r>
-      <w:proofErr w:type="spellStart"/>
-      <w:r>
-        <w:rPr>
-          <w:lang w:val="hu-HU"/>
-        </w:rPr>
-        <w:t>kerülhessen</w:t>
-      </w:r>
-      <w:proofErr w:type="spellEnd"/>
-      <w:r>
-        <w:rPr>
-          <w:lang w:val="hu-HU"/>
-        </w:rPr>
-        <w:t xml:space="preserve"> kijelzésre.</w:t>
-      </w:r>
-      <w:r>
-        <w:rPr>
-          <w:lang w:val="hu-HU"/>
-        </w:rPr>
-        <w:t xml:space="preserve"> </w:t>
+        <w:t>A pontos mérés érdekében 1 darab hardver-megszakítás érkezhet a számláló egység felől 1mp elteltével, hogy a következő ciklusban már az új érték kerülhessen kijelzésre</w:t>
+      </w:r>
+      <w:r>
+        <w:rPr>
+          <w:lang w:val="hu-HU"/>
+        </w:rPr>
+        <w:t>, továbbításra.</w:t>
       </w:r>
     </w:p>
     <w:p>
@@ -1047,7 +1270,6 @@
         <w:rPr>
           <w:noProof/>
         </w:rPr>
-        <w:lastRenderedPageBreak/>
         <w:drawing>
           <wp:anchor distT="0" distB="0" distL="114300" distR="114300" simplePos="0" relativeHeight="251658240" behindDoc="0" locked="0" layoutInCell="1" allowOverlap="1" wp14:anchorId="336FA187" wp14:editId="0E0A963F">
             <wp:simplePos x="0" y="0"/>
@@ -6149,15 +6371,7 @@
           <w:szCs w:val="22"/>
           <w:lang w:val="hu-HU"/>
         </w:rPr>
-        <w:t xml:space="preserve"> / 1000U)</w:t>
-      </w:r>
-      <w:r>
-        <w:rPr>
-          <w:sz w:val="22"/>
-          <w:szCs w:val="22"/>
-          <w:lang w:val="hu-HU"/>
-        </w:rPr>
-        <w:t>;</w:t>
+        <w:t xml:space="preserve"> / 1000U);</w:t>
       </w:r>
     </w:p>
     <w:p>
@@ -6288,7 +6502,39 @@
           <w:szCs w:val="22"/>
           <w:lang w:val="hu-HU"/>
         </w:rPr>
-        <w:t>USART be, speciális és kimeneti tároló</w:t>
+        <w:t>USART be</w:t>
+      </w:r>
+      <w:r>
+        <w:rPr>
+          <w:sz w:val="22"/>
+          <w:szCs w:val="22"/>
+          <w:lang w:val="hu-HU"/>
+        </w:rPr>
+        <w:t>-</w:t>
+      </w:r>
+      <w:r>
+        <w:rPr>
+          <w:sz w:val="22"/>
+          <w:szCs w:val="22"/>
+          <w:lang w:val="hu-HU"/>
+        </w:rPr>
+        <w:t>, speciális</w:t>
+      </w:r>
+      <w:r>
+        <w:rPr>
+          <w:sz w:val="22"/>
+          <w:szCs w:val="22"/>
+          <w:lang w:val="hu-HU"/>
+        </w:rPr>
+        <w:t>-</w:t>
+      </w:r>
+      <w:r>
+        <w:rPr>
+          <w:sz w:val="22"/>
+          <w:szCs w:val="22"/>
+          <w:lang w:val="hu-HU"/>
+        </w:rPr>
+        <w:t xml:space="preserve"> és kimeneti tároló</w:t>
       </w:r>
       <w:r>
         <w:rPr>
@@ -6436,7 +6682,23 @@
           <w:szCs w:val="22"/>
           <w:lang w:val="hu-HU"/>
         </w:rPr>
-        <w:t>Typedf</w:t>
+        <w:t>Typed</w:t>
+      </w:r>
+      <w:r>
+        <w:rPr>
+          <w:sz w:val="22"/>
+          <w:szCs w:val="22"/>
+          <w:lang w:val="hu-HU"/>
+        </w:rPr>
+        <w:t>e</w:t>
+      </w:r>
+      <w:r>
+        <w:rPr>
+          <w:sz w:val="22"/>
+          <w:szCs w:val="22"/>
+          <w:lang w:val="hu-HU"/>
+        </w:rPr>
+        <w:t>f</w:t>
       </w:r>
       <w:proofErr w:type="spellEnd"/>
       <w:r>
@@ -6983,6 +7245,14 @@
         </w:rPr>
         <w:t>nem használt</w:t>
       </w:r>
+      <w:r>
+        <w:rPr>
+          <w:sz w:val="22"/>
+          <w:szCs w:val="22"/>
+          <w:lang w:val="hu-HU"/>
+        </w:rPr>
+        <w:t xml:space="preserve"> (NIX)</w:t>
+      </w:r>
     </w:p>
     <w:p>
       <w:pPr>
@@ -7473,23 +7743,7 @@
           <w:szCs w:val="22"/>
           <w:lang w:val="hu-HU"/>
         </w:rPr>
-        <w:t xml:space="preserve"> </w:t>
-      </w:r>
-      <w:r>
-        <w:rPr>
-          <w:sz w:val="22"/>
-          <w:szCs w:val="22"/>
-          <w:lang w:val="hu-HU"/>
-        </w:rPr>
-        <w:t>megállította</w:t>
-      </w:r>
-      <w:r>
-        <w:rPr>
-          <w:sz w:val="22"/>
-          <w:szCs w:val="22"/>
-          <w:lang w:val="hu-HU"/>
-        </w:rPr>
-        <w:t xml:space="preserve"> </w:t>
+        <w:t xml:space="preserve"> megállította </w:t>
       </w:r>
       <w:proofErr w:type="spellStart"/>
       <w:r>
@@ -8228,6 +8482,14 @@
         <w:t xml:space="preserve"> </w:t>
       </w:r>
       <w:proofErr w:type="spellStart"/>
+      <w:r>
+        <w:rPr>
+          <w:sz w:val="22"/>
+          <w:szCs w:val="22"/>
+          <w:lang w:val="hu-HU"/>
+        </w:rPr>
+        <w:t>meth_out_</w:t>
+      </w:r>
       <w:proofErr w:type="gramStart"/>
       <w:r>
         <w:rPr>
@@ -8235,7 +8497,7 @@
           <w:szCs w:val="22"/>
           <w:lang w:val="hu-HU"/>
         </w:rPr>
-        <w:t>meth</w:t>
+        <w:t>value</w:t>
       </w:r>
       <w:proofErr w:type="spellEnd"/>
       <w:r>
@@ -8273,6 +8535,42 @@
           <w:lang w:val="hu-HU"/>
         </w:rPr>
         <w:t>vars</w:t>
+      </w:r>
+      <w:proofErr w:type="spellEnd"/>
+      <w:r>
+        <w:rPr>
+          <w:sz w:val="22"/>
+          <w:szCs w:val="22"/>
+          <w:lang w:val="hu-HU"/>
+        </w:rPr>
+        <w:t xml:space="preserve">, </w:t>
+      </w:r>
+      <w:proofErr w:type="spellStart"/>
+      <w:r>
+        <w:rPr>
+          <w:sz w:val="22"/>
+          <w:szCs w:val="22"/>
+          <w:lang w:val="hu-HU"/>
+        </w:rPr>
+        <w:t>double</w:t>
+      </w:r>
+      <w:proofErr w:type="spellEnd"/>
+      <w:r>
+        <w:rPr>
+          <w:sz w:val="22"/>
+          <w:szCs w:val="22"/>
+          <w:lang w:val="hu-HU"/>
+        </w:rPr>
+        <w:t xml:space="preserve"> </w:t>
+      </w:r>
+      <w:proofErr w:type="spellStart"/>
+      <w:r>
+        <w:rPr>
+          <w:sz w:val="22"/>
+          <w:szCs w:val="22"/>
+          <w:lang w:val="hu-HU"/>
+        </w:rPr>
+        <w:t>out_val</w:t>
       </w:r>
       <w:proofErr w:type="spellEnd"/>
       <w:r>
@@ -8318,59 +8616,81 @@
           <w:szCs w:val="22"/>
           <w:lang w:val="hu-HU"/>
         </w:rPr>
-        <w:t xml:space="preserve">függvény. A paraméterlistából – ha nem aktív a szemafor - kiolvassa a </w:t>
-      </w:r>
-      <w:proofErr w:type="spellStart"/>
-      <w:r>
-        <w:rPr>
-          <w:sz w:val="22"/>
-          <w:szCs w:val="22"/>
-          <w:lang w:val="hu-HU"/>
-        </w:rPr>
-        <w:t>vars</w:t>
-      </w:r>
-      <w:proofErr w:type="spellEnd"/>
-      <w:r>
-        <w:rPr>
-          <w:sz w:val="22"/>
-          <w:szCs w:val="22"/>
-          <w:lang w:val="hu-HU"/>
-        </w:rPr>
-        <w:t>[</w:t>
-      </w:r>
-      <w:proofErr w:type="spellStart"/>
-      <w:r>
-        <w:rPr>
-          <w:sz w:val="22"/>
-          <w:szCs w:val="22"/>
-          <w:lang w:val="hu-HU"/>
-        </w:rPr>
-        <w:t>cps</w:t>
-      </w:r>
-      <w:proofErr w:type="spellEnd"/>
-      <w:r>
-        <w:rPr>
-          <w:sz w:val="22"/>
-          <w:szCs w:val="22"/>
-          <w:lang w:val="hu-HU"/>
-        </w:rPr>
-        <w:t xml:space="preserve">]-t (a beütések számát) és kiszámolja a többi paramétert. </w:t>
-      </w:r>
-      <w:r>
-        <w:rPr>
-          <w:sz w:val="22"/>
-          <w:szCs w:val="22"/>
-          <w:lang w:val="hu-HU"/>
-        </w:rPr>
-        <w:t>K</w:t>
-      </w:r>
-      <w:r>
-        <w:rPr>
-          <w:sz w:val="22"/>
-          <w:szCs w:val="22"/>
-          <w:lang w:val="hu-HU"/>
-        </w:rPr>
-        <w:t>iszámítja a DAC-</w:t>
+        <w:t xml:space="preserve">függvény. A </w:t>
+      </w:r>
+      <w:r>
+        <w:rPr>
+          <w:sz w:val="22"/>
+          <w:szCs w:val="22"/>
+          <w:lang w:val="hu-HU"/>
+        </w:rPr>
+        <w:t>megkapott „</w:t>
+      </w:r>
+      <w:proofErr w:type="spellStart"/>
+      <w:r>
+        <w:rPr>
+          <w:sz w:val="22"/>
+          <w:szCs w:val="22"/>
+          <w:lang w:val="hu-HU"/>
+        </w:rPr>
+        <w:t>out_val</w:t>
+      </w:r>
+      <w:proofErr w:type="spellEnd"/>
+      <w:r>
+        <w:rPr>
+          <w:sz w:val="22"/>
+          <w:szCs w:val="22"/>
+          <w:lang w:val="hu-HU"/>
+        </w:rPr>
+        <w:t xml:space="preserve">” érték </w:t>
+      </w:r>
+      <w:r>
+        <w:rPr>
+          <w:sz w:val="22"/>
+          <w:szCs w:val="22"/>
+          <w:lang w:val="hu-HU"/>
+        </w:rPr>
+        <w:t>(a beütések szám</w:t>
+      </w:r>
+      <w:r>
+        <w:rPr>
+          <w:sz w:val="22"/>
+          <w:szCs w:val="22"/>
+          <w:lang w:val="hu-HU"/>
+        </w:rPr>
+        <w:t>a</w:t>
+      </w:r>
+      <w:r>
+        <w:rPr>
+          <w:sz w:val="22"/>
+          <w:szCs w:val="22"/>
+          <w:lang w:val="hu-HU"/>
+        </w:rPr>
+        <w:t>)</w:t>
+      </w:r>
+      <w:r>
+        <w:rPr>
+          <w:sz w:val="22"/>
+          <w:szCs w:val="22"/>
+          <w:lang w:val="hu-HU"/>
+        </w:rPr>
+        <w:t xml:space="preserve"> alapján</w:t>
+      </w:r>
+      <w:r>
+        <w:rPr>
+          <w:sz w:val="22"/>
+          <w:szCs w:val="22"/>
+          <w:lang w:val="hu-HU"/>
+        </w:rPr>
+        <w:t xml:space="preserve"> kiszámolja a többi paramétert. </w:t>
+      </w:r>
+      <w:r>
+        <w:rPr>
+          <w:sz w:val="22"/>
+          <w:szCs w:val="22"/>
+          <w:lang w:val="hu-HU"/>
+        </w:rPr>
+        <w:t>Kiszámítja a DAC-</w:t>
       </w:r>
       <w:proofErr w:type="spellStart"/>
       <w:r>
@@ -9375,7 +9695,6 @@
           <w:szCs w:val="22"/>
           <w:lang w:val="hu-HU"/>
         </w:rPr>
-        <w:lastRenderedPageBreak/>
         <w:t>MRTimer</w:t>
       </w:r>
       <w:proofErr w:type="spellEnd"/>
@@ -9408,6 +9727,7 @@
           <w:szCs w:val="22"/>
           <w:lang w:val="hu-HU"/>
         </w:rPr>
+        <w:lastRenderedPageBreak/>
         <w:t>Fő</w:t>
       </w:r>
       <w:r>
@@ -9505,6 +9825,52 @@
           <w:szCs w:val="22"/>
           <w:lang w:val="hu-HU"/>
         </w:rPr>
+        <w:t>CPS kiolvasása a „</w:t>
+      </w:r>
+      <w:proofErr w:type="spellStart"/>
+      <w:proofErr w:type="gramStart"/>
+      <w:r>
+        <w:rPr>
+          <w:sz w:val="22"/>
+          <w:szCs w:val="22"/>
+          <w:lang w:val="hu-HU"/>
+        </w:rPr>
+        <w:t>vars</w:t>
+      </w:r>
+      <w:proofErr w:type="spellEnd"/>
+      <w:r>
+        <w:rPr>
+          <w:sz w:val="22"/>
+          <w:szCs w:val="22"/>
+          <w:lang w:val="hu-HU"/>
+        </w:rPr>
+        <w:t>”-</w:t>
+      </w:r>
+      <w:proofErr w:type="spellStart"/>
+      <w:proofErr w:type="gramEnd"/>
+      <w:r>
+        <w:rPr>
+          <w:sz w:val="22"/>
+          <w:szCs w:val="22"/>
+          <w:lang w:val="hu-HU"/>
+        </w:rPr>
+        <w:t>ból</w:t>
+      </w:r>
+      <w:proofErr w:type="spellEnd"/>
+      <w:r>
+        <w:rPr>
+          <w:sz w:val="22"/>
+          <w:szCs w:val="22"/>
+          <w:lang w:val="hu-HU"/>
+        </w:rPr>
+        <w:t xml:space="preserve">, hogyha a szemafor inaktív, </w:t>
+      </w:r>
+      <w:r>
+        <w:rPr>
+          <w:sz w:val="22"/>
+          <w:szCs w:val="22"/>
+          <w:lang w:val="hu-HU"/>
+        </w:rPr>
         <w:t>Matematika</w:t>
       </w:r>
       <w:r>
@@ -9524,6 +9890,22 @@
         <w:t xml:space="preserve"> </w:t>
       </w:r>
       <w:proofErr w:type="spellStart"/>
+      <w:r>
+        <w:rPr>
+          <w:sz w:val="22"/>
+          <w:szCs w:val="22"/>
+          <w:lang w:val="hu-HU"/>
+        </w:rPr>
+        <w:t>meth</w:t>
+      </w:r>
+      <w:r>
+        <w:rPr>
+          <w:sz w:val="22"/>
+          <w:szCs w:val="22"/>
+          <w:lang w:val="hu-HU"/>
+        </w:rPr>
+        <w:t>_out_</w:t>
+      </w:r>
       <w:proofErr w:type="gramStart"/>
       <w:r>
         <w:rPr>
@@ -9531,7 +9913,7 @@
           <w:szCs w:val="22"/>
           <w:lang w:val="hu-HU"/>
         </w:rPr>
-        <w:t>meth</w:t>
+        <w:t>value</w:t>
       </w:r>
       <w:proofErr w:type="spellEnd"/>
       <w:r>
@@ -9561,6 +9943,22 @@
         <w:t>fv</w:t>
       </w:r>
       <w:proofErr w:type="spellEnd"/>
+      <w:r>
+        <w:rPr>
+          <w:sz w:val="22"/>
+          <w:szCs w:val="22"/>
+          <w:lang w:val="hu-HU"/>
+        </w:rPr>
+        <w:t>.</w:t>
+      </w:r>
+      <w:r>
+        <w:rPr>
+          <w:sz w:val="22"/>
+          <w:szCs w:val="22"/>
+          <w:lang w:val="hu-HU"/>
+        </w:rPr>
+        <w:t xml:space="preserve"> meghívása</w:t>
+      </w:r>
       <w:r>
         <w:rPr>
           <w:sz w:val="22"/>
@@ -9642,7 +10040,7 @@
           <w:szCs w:val="22"/>
           <w:lang w:val="hu-HU"/>
         </w:rPr>
-        <w:t>.</w:t>
+        <w:t xml:space="preserve"> meghívása.</w:t>
       </w:r>
     </w:p>
     <w:p>
@@ -10251,14 +10649,7 @@
             <w:rStyle w:val="Hiperhivatkozs"/>
             <w:lang w:val="hu-HU"/>
           </w:rPr>
-          <w:t>h</w:t>
-        </w:r>
-        <w:r>
-          <w:rPr>
-            <w:rStyle w:val="Hiperhivatkozs"/>
-            <w:lang w:val="hu-HU"/>
-          </w:rPr>
-          <w:t>ttps://home.mit.bme.hu/~benes/oktatas/vimm9151/JEGYZET/jegyzet.html</w:t>
+          <w:t>https://home.mit.bme.hu/~benes/oktatas/vimm9151/JEGYZET/jegyzet.html</w:t>
         </w:r>
       </w:hyperlink>
       <w:r>
@@ -10432,17 +10823,7 @@
         <w:szCs w:val="22"/>
         <w:lang w:val="hu-HU"/>
       </w:rPr>
-      <w:t>GM-csöves detektor</w:t>
-    </w:r>
-    <w:r>
-      <w:rPr>
-        <w:i/>
-        <w:iCs/>
-        <w:sz w:val="22"/>
-        <w:szCs w:val="22"/>
-        <w:lang w:val="hu-HU"/>
-      </w:rPr>
-      <w:t xml:space="preserve"> – </w:t>
+      <w:t xml:space="preserve">GM-csöves detektor – </w:t>
     </w:r>
     <w:proofErr w:type="spellStart"/>
     <w:r>
@@ -11238,6 +11619,119 @@
     </w:lvl>
   </w:abstractNum>
   <w:abstractNum w:abstractNumId="7" w15:restartNumberingAfterBreak="0">
+    <w:nsid w:val="6D331179"/>
+    <w:multiLevelType w:val="hybridMultilevel"/>
+    <w:tmpl w:val="295C238C"/>
+    <w:lvl w:ilvl="0" w:tplc="08090001">
+      <w:start w:val="1"/>
+      <w:numFmt w:val="bullet"/>
+      <w:lvlText w:val=""/>
+      <w:lvlJc w:val="left"/>
+      <w:pPr>
+        <w:ind w:left="720" w:hanging="360"/>
+      </w:pPr>
+      <w:rPr>
+        <w:rFonts w:ascii="Symbol" w:hAnsi="Symbol" w:hint="default"/>
+      </w:rPr>
+    </w:lvl>
+    <w:lvl w:ilvl="1" w:tplc="08090003" w:tentative="1">
+      <w:start w:val="1"/>
+      <w:numFmt w:val="bullet"/>
+      <w:lvlText w:val="o"/>
+      <w:lvlJc w:val="left"/>
+      <w:pPr>
+        <w:ind w:left="1440" w:hanging="360"/>
+      </w:pPr>
+      <w:rPr>
+        <w:rFonts w:ascii="Courier New" w:hAnsi="Courier New" w:cs="Courier New" w:hint="default"/>
+      </w:rPr>
+    </w:lvl>
+    <w:lvl w:ilvl="2" w:tplc="08090005" w:tentative="1">
+      <w:start w:val="1"/>
+      <w:numFmt w:val="bullet"/>
+      <w:lvlText w:val=""/>
+      <w:lvlJc w:val="left"/>
+      <w:pPr>
+        <w:ind w:left="2160" w:hanging="360"/>
+      </w:pPr>
+      <w:rPr>
+        <w:rFonts w:ascii="Wingdings" w:hAnsi="Wingdings" w:hint="default"/>
+      </w:rPr>
+    </w:lvl>
+    <w:lvl w:ilvl="3" w:tplc="08090001" w:tentative="1">
+      <w:start w:val="1"/>
+      <w:numFmt w:val="bullet"/>
+      <w:lvlText w:val=""/>
+      <w:lvlJc w:val="left"/>
+      <w:pPr>
+        <w:ind w:left="2880" w:hanging="360"/>
+      </w:pPr>
+      <w:rPr>
+        <w:rFonts w:ascii="Symbol" w:hAnsi="Symbol" w:hint="default"/>
+      </w:rPr>
+    </w:lvl>
+    <w:lvl w:ilvl="4" w:tplc="08090003" w:tentative="1">
+      <w:start w:val="1"/>
+      <w:numFmt w:val="bullet"/>
+      <w:lvlText w:val="o"/>
+      <w:lvlJc w:val="left"/>
+      <w:pPr>
+        <w:ind w:left="3600" w:hanging="360"/>
+      </w:pPr>
+      <w:rPr>
+        <w:rFonts w:ascii="Courier New" w:hAnsi="Courier New" w:cs="Courier New" w:hint="default"/>
+      </w:rPr>
+    </w:lvl>
+    <w:lvl w:ilvl="5" w:tplc="08090005" w:tentative="1">
+      <w:start w:val="1"/>
+      <w:numFmt w:val="bullet"/>
+      <w:lvlText w:val=""/>
+      <w:lvlJc w:val="left"/>
+      <w:pPr>
+        <w:ind w:left="4320" w:hanging="360"/>
+      </w:pPr>
+      <w:rPr>
+        <w:rFonts w:ascii="Wingdings" w:hAnsi="Wingdings" w:hint="default"/>
+      </w:rPr>
+    </w:lvl>
+    <w:lvl w:ilvl="6" w:tplc="08090001" w:tentative="1">
+      <w:start w:val="1"/>
+      <w:numFmt w:val="bullet"/>
+      <w:lvlText w:val=""/>
+      <w:lvlJc w:val="left"/>
+      <w:pPr>
+        <w:ind w:left="5040" w:hanging="360"/>
+      </w:pPr>
+      <w:rPr>
+        <w:rFonts w:ascii="Symbol" w:hAnsi="Symbol" w:hint="default"/>
+      </w:rPr>
+    </w:lvl>
+    <w:lvl w:ilvl="7" w:tplc="08090003" w:tentative="1">
+      <w:start w:val="1"/>
+      <w:numFmt w:val="bullet"/>
+      <w:lvlText w:val="o"/>
+      <w:lvlJc w:val="left"/>
+      <w:pPr>
+        <w:ind w:left="5760" w:hanging="360"/>
+      </w:pPr>
+      <w:rPr>
+        <w:rFonts w:ascii="Courier New" w:hAnsi="Courier New" w:cs="Courier New" w:hint="default"/>
+      </w:rPr>
+    </w:lvl>
+    <w:lvl w:ilvl="8" w:tplc="08090005" w:tentative="1">
+      <w:start w:val="1"/>
+      <w:numFmt w:val="bullet"/>
+      <w:lvlText w:val=""/>
+      <w:lvlJc w:val="left"/>
+      <w:pPr>
+        <w:ind w:left="6480" w:hanging="360"/>
+      </w:pPr>
+      <w:rPr>
+        <w:rFonts w:ascii="Wingdings" w:hAnsi="Wingdings" w:hint="default"/>
+      </w:rPr>
+    </w:lvl>
+  </w:abstractNum>
+  <w:abstractNum w:abstractNumId="8" w15:restartNumberingAfterBreak="0">
     <w:nsid w:val="7D9F7EBD"/>
     <w:multiLevelType w:val="hybridMultilevel"/>
     <w:tmpl w:val="B712CF4A"/>
@@ -11357,7 +11851,7 @@
     <w:abstractNumId w:val="2"/>
   </w:num>
   <w:num w:numId="3" w16cid:durableId="540675669">
-    <w:abstractNumId w:val="7"/>
+    <w:abstractNumId w:val="8"/>
   </w:num>
   <w:num w:numId="4" w16cid:durableId="1921256414">
     <w:abstractNumId w:val="6"/>
@@ -11373,6 +11867,9 @@
   </w:num>
   <w:num w:numId="8" w16cid:durableId="1780682830">
     <w:abstractNumId w:val="3"/>
+  </w:num>
+  <w:num w:numId="9" w16cid:durableId="1338457581">
+    <w:abstractNumId w:val="7"/>
   </w:num>
 </w:numbering>
 </file>

</xml_diff>